<commit_message>
auto: push changes 2026-09-04_22-32-37,50
</commit_message>
<xml_diff>
--- a/Generateur Des Factures/Factures/Facture numéro 9-2026.docx
+++ b/Generateur Des Factures/Factures/Facture numéro 9-2026.docx
@@ -62,10 +62,6 @@
               </w:rPr>
               <w:t>Facture numéro :  9/2026</w:t>
             </w:r>
-            <w:proofErr w:type="gramStart"/>
-            <w:proofErr w:type="gramEnd"/>
-            <w:proofErr w:type="spellStart"/>
-            <w:proofErr w:type="spellEnd"/>
           </w:p>
         </w:tc>
       </w:tr>
@@ -112,10 +108,34 @@
                 <w:szCs w:val="24"/>
                 <w:lang w:val="fr-FR" w:eastAsia="fr-MA"/>
               </w:rPr>
-              <w:t>Date : 02/07/2026</w:t>
+              <w:t>Date : 0</w:t>
             </w:r>
-            <w:proofErr w:type="spellStart"/>
-            <w:proofErr w:type="spellEnd"/>
+            <w:r>
+              <w:rPr>
+                <w:rFonts w:ascii="Aptos" w:eastAsia="Times New Roman" w:hAnsi="Aptos" w:cs="Arial"/>
+                <w:b/>
+                <w:bCs/>
+                <w:color w:val="000000"/>
+                <w:kern w:val="24"/>
+                <w:sz w:val="24"/>
+                <w:szCs w:val="24"/>
+                <w:lang w:val="fr-FR" w:eastAsia="fr-MA"/>
+              </w:rPr>
+              <w:t>9</w:t>
+            </w:r>
+            <w:r>
+              <w:rPr>
+                <w:rFonts w:ascii="Aptos" w:eastAsia="Times New Roman" w:hAnsi="Aptos" w:cs="Arial"/>
+                <w:b/>
+                <w:bCs/>
+                <w:color w:val="000000"/>
+                <w:kern w:val="24"/>
+                <w:sz w:val="24"/>
+                <w:szCs w:val="24"/>
+                <w:lang w:val="fr-FR" w:eastAsia="fr-MA"/>
+              </w:rPr>
+              <w:t>/07/2026</w:t>
+            </w:r>
           </w:p>
         </w:tc>
       </w:tr>
@@ -191,7 +211,6 @@
             </wp14:sizeRelV>
           </wp:anchor>
         </w:drawing>
-        <w:t/>
       </w:r>
     </w:p>
     <w:p>
@@ -232,7 +251,7 @@
     </w:p>
     <w:tbl>
       <w:tblPr>
-        <w:tblStyle w:val="TableGrid"/>
+        <w:tblStyle w:val="Grilledutableau"/>
         <w:tblpPr w:leftFromText="180" w:rightFromText="180" w:vertAnchor="text" w:horzAnchor="page" w:tblpX="661" w:tblpY="318"/>
         <w:tblW w:w="9180" w:type="dxa"/>
         <w:tblBorders>
@@ -279,8 +298,6 @@
               </w:rPr>
               <w:t>ESAQ Certif</w:t>
             </w:r>
-            <w:proofErr w:type="spellStart"/>
-            <w:proofErr w:type="spellEnd"/>
           </w:p>
           <w:p>
             <w:pPr>
@@ -363,11 +380,8 @@
                 <w:szCs w:val="24"/>
                 <w:lang w:val="fr-FR"/>
               </w:rPr>
-              <w:t>12 rue sabri boujemaa 1er etg N 6, 
-Casablanca 20150</w:t>
+              <w:t>12 rue sabri boujemaa 1er etg N 6,  Casablanca 20150</w:t>
             </w:r>
-            <w:proofErr w:type="spellStart"/>
-            <w:proofErr w:type="spellEnd"/>
           </w:p>
         </w:tc>
       </w:tr>
@@ -399,8 +413,6 @@
               </w:rPr>
               <w:t>ICE : 003503208000024</w:t>
             </w:r>
-            <w:proofErr w:type="spellStart"/>
-            <w:proofErr w:type="spellEnd"/>
           </w:p>
         </w:tc>
       </w:tr>
@@ -797,6 +809,27 @@
               </w:rPr>
               <w:t xml:space="preserve">• Travaux en Hauteur </w:t>
             </w:r>
+          </w:p>
+          <w:p>
+            <w:pPr>
+              <w:spacing w:after="0" w:line="240" w:lineRule="auto"/>
+              <w:ind w:left="120"/>
+              <w:rPr>
+                <w:rFonts w:ascii="Arial" w:eastAsia="Times New Roman" w:hAnsi="Arial" w:cs="Arial"/>
+                <w:sz w:val="24"/>
+                <w:szCs w:val="24"/>
+                <w:lang w:val="fr-FR" w:eastAsia="fr-MA"/>
+              </w:rPr>
+            </w:pPr>
+            <w:r>
+              <w:rPr>
+                <w:rFonts w:ascii="Arial" w:eastAsia="Times New Roman" w:hAnsi="Arial" w:cs="Arial"/>
+                <w:sz w:val="24"/>
+                <w:szCs w:val="24"/>
+                <w:lang w:val="fr-FR" w:eastAsia="fr-MA"/>
+              </w:rPr>
+              <w:t xml:space="preserve"> </w:t>
+            </w:r>
             <w:r>
               <w:rPr>
                 <w:rFonts w:ascii="Arial" w:eastAsia="Times New Roman" w:hAnsi="Arial" w:cs="Arial"/>
@@ -806,7 +839,7 @@
                 <w:szCs w:val="20"/>
                 <w:lang w:eastAsia="fr-MA"/>
               </w:rPr>
-              <w:t/>
+              <w:t>Le 1 juillet  2026</w:t>
             </w:r>
           </w:p>
           <w:p>
@@ -829,17 +862,6 @@
               </w:rPr>
               <w:t xml:space="preserve"> </w:t>
             </w:r>
-            <w:r>
-              <w:rPr>
-                <w:rFonts w:ascii="Arial" w:eastAsia="Times New Roman" w:hAnsi="Arial" w:cs="Arial"/>
-                <w:b/>
-                <w:bCs/>
-                <w:sz w:val="20"/>
-                <w:szCs w:val="20"/>
-                <w:lang w:eastAsia="fr-MA"/>
-              </w:rPr>
-              <w:t>Le 1 juillet  2026</w:t>
-            </w:r>
           </w:p>
           <w:p>
             <w:pPr>
@@ -861,17 +883,6 @@
               </w:rPr>
               <w:t xml:space="preserve"> </w:t>
             </w:r>
-            <w:r>
-              <w:rPr>
-                <w:rFonts w:ascii="Arial" w:eastAsia="Times New Roman" w:hAnsi="Arial" w:cs="Arial"/>
-                <w:b/>
-                <w:bCs/>
-                <w:sz w:val="20"/>
-                <w:szCs w:val="20"/>
-                <w:lang w:eastAsia="fr-MA"/>
-              </w:rPr>
-              <w:t/>
-            </w:r>
           </w:p>
           <w:p>
             <w:pPr>
@@ -893,49 +904,17 @@
               </w:rPr>
               <w:t xml:space="preserve"> </w:t>
             </w:r>
-            <w:r>
-              <w:rPr>
-                <w:rFonts w:ascii="Arial" w:eastAsia="Times New Roman" w:hAnsi="Arial" w:cs="Arial"/>
-                <w:b/>
-                <w:bCs/>
-                <w:sz w:val="20"/>
-                <w:szCs w:val="20"/>
-                <w:lang w:eastAsia="fr-MA"/>
-              </w:rPr>
-              <w:t/>
-            </w:r>
           </w:p>
           <w:p>
             <w:pPr>
               <w:spacing w:after="0" w:line="240" w:lineRule="auto"/>
-              <w:ind w:left="120"/>
               <w:rPr>
                 <w:rFonts w:ascii="Arial" w:eastAsia="Times New Roman" w:hAnsi="Arial" w:cs="Arial"/>
                 <w:sz w:val="24"/>
-                <w:szCs w:val="24"/>
+                <w:szCs w:val="36"/>
                 <w:lang w:val="fr-FR" w:eastAsia="fr-MA"/>
               </w:rPr>
             </w:pPr>
-            <w:r>
-              <w:rPr>
-                <w:rFonts w:ascii="Arial" w:eastAsia="Times New Roman" w:hAnsi="Arial" w:cs="Arial"/>
-                <w:sz w:val="24"/>
-                <w:szCs w:val="24"/>
-                <w:lang w:val="fr-FR" w:eastAsia="fr-MA"/>
-              </w:rPr>
-              <w:t xml:space="preserve"> </w:t>
-            </w:r>
-            <w:r>
-              <w:rPr>
-                <w:rFonts w:ascii="Arial" w:eastAsia="Times New Roman" w:hAnsi="Arial" w:cs="Arial"/>
-                <w:b/>
-                <w:bCs/>
-                <w:sz w:val="20"/>
-                <w:szCs w:val="20"/>
-                <w:lang w:eastAsia="fr-MA"/>
-              </w:rPr>
-              <w:t/>
-            </w:r>
           </w:p>
           <w:p>
             <w:pPr>
@@ -944,18 +923,7 @@
                 <w:rFonts w:ascii="Arial" w:eastAsia="Times New Roman" w:hAnsi="Arial" w:cs="Arial"/>
                 <w:sz w:val="24"/>
                 <w:szCs w:val="36"/>
-                <w:lang w:val="en-US" w:eastAsia="fr-MA"/>
-              </w:rPr>
-            </w:pPr>
-          </w:p>
-          <w:p>
-            <w:pPr>
-              <w:spacing w:after="0" w:line="240" w:lineRule="auto"/>
-              <w:rPr>
-                <w:rFonts w:ascii="Arial" w:eastAsia="Times New Roman" w:hAnsi="Arial" w:cs="Arial"/>
-                <w:sz w:val="24"/>
-                <w:szCs w:val="36"/>
-                <w:lang w:val="en-US" w:eastAsia="fr-MA"/>
+                <w:lang w:val="fr-FR" w:eastAsia="fr-MA"/>
               </w:rPr>
             </w:pPr>
           </w:p>
@@ -1013,7 +981,10 @@
                 <w:lang w:val="en-US" w:eastAsia="fr-MA"/>
               </w:rPr>
             </w:pPr>
-            <w:r>
+          </w:p>
+          <w:p>
+            <w:pPr>
+              <w:spacing w:after="0" w:line="240" w:lineRule="auto"/>
               <w:rPr>
                 <w:rFonts w:ascii="Aptos" w:eastAsia="Times New Roman" w:hAnsi="Aptos" w:cs="Arial"/>
                 <w:color w:val="000000"/>
@@ -1022,8 +993,7 @@
                 <w:szCs w:val="24"/>
                 <w:lang w:val="en-US" w:eastAsia="fr-MA"/>
               </w:rPr>
-              <w:t/>
-            </w:r>
+            </w:pPr>
           </w:p>
           <w:p>
             <w:pPr>
@@ -1037,7 +1007,10 @@
                 <w:lang w:val="en-US" w:eastAsia="fr-MA"/>
               </w:rPr>
             </w:pPr>
-            <w:r>
+          </w:p>
+          <w:p>
+            <w:pPr>
+              <w:spacing w:after="0" w:line="240" w:lineRule="auto"/>
               <w:rPr>
                 <w:rFonts w:ascii="Aptos" w:eastAsia="Times New Roman" w:hAnsi="Aptos" w:cs="Arial"/>
                 <w:color w:val="000000"/>
@@ -1046,56 +1019,7 @@
                 <w:szCs w:val="24"/>
                 <w:lang w:val="en-US" w:eastAsia="fr-MA"/>
               </w:rPr>
-              <w:t/>
-            </w:r>
-          </w:p>
-          <w:p>
-            <w:pPr>
-              <w:spacing w:after="0" w:line="240" w:lineRule="auto"/>
-              <w:rPr>
-                <w:rFonts w:ascii="Aptos" w:eastAsia="Times New Roman" w:hAnsi="Aptos" w:cs="Arial"/>
-                <w:color w:val="000000"/>
-                <w:kern w:val="24"/>
-                <w:sz w:val="24"/>
-                <w:szCs w:val="24"/>
-                <w:lang w:val="en-US" w:eastAsia="fr-MA"/>
-              </w:rPr>
             </w:pPr>
-            <w:r>
-              <w:rPr>
-                <w:rFonts w:ascii="Aptos" w:eastAsia="Times New Roman" w:hAnsi="Aptos" w:cs="Arial"/>
-                <w:color w:val="000000"/>
-                <w:kern w:val="24"/>
-                <w:sz w:val="24"/>
-                <w:szCs w:val="24"/>
-                <w:lang w:val="en-US" w:eastAsia="fr-MA"/>
-              </w:rPr>
-              <w:t/>
-            </w:r>
-          </w:p>
-          <w:p>
-            <w:pPr>
-              <w:spacing w:after="0" w:line="240" w:lineRule="auto"/>
-              <w:rPr>
-                <w:rFonts w:ascii="Aptos" w:eastAsia="Times New Roman" w:hAnsi="Aptos" w:cs="Arial"/>
-                <w:color w:val="000000"/>
-                <w:kern w:val="24"/>
-                <w:sz w:val="24"/>
-                <w:szCs w:val="24"/>
-                <w:lang w:val="en-US" w:eastAsia="fr-MA"/>
-              </w:rPr>
-            </w:pPr>
-            <w:r>
-              <w:rPr>
-                <w:rFonts w:ascii="Aptos" w:eastAsia="Times New Roman" w:hAnsi="Aptos" w:cs="Arial"/>
-                <w:color w:val="000000"/>
-                <w:kern w:val="24"/>
-                <w:sz w:val="24"/>
-                <w:szCs w:val="24"/>
-                <w:lang w:val="en-US" w:eastAsia="fr-MA"/>
-              </w:rPr>
-              <w:t/>
-            </w:r>
           </w:p>
         </w:tc>
         <w:tc>
@@ -1151,7 +1075,10 @@
                 <w:lang w:val="en-US" w:eastAsia="fr-MA"/>
               </w:rPr>
             </w:pPr>
-            <w:r>
+          </w:p>
+          <w:p>
+            <w:pPr>
+              <w:spacing w:after="0" w:line="240" w:lineRule="auto"/>
               <w:rPr>
                 <w:rFonts w:ascii="Aptos" w:eastAsia="Times New Roman" w:hAnsi="Aptos" w:cs="Arial"/>
                 <w:color w:val="000000"/>
@@ -1160,8 +1087,7 @@
                 <w:szCs w:val="24"/>
                 <w:lang w:val="en-US" w:eastAsia="fr-MA"/>
               </w:rPr>
-              <w:t/>
-            </w:r>
+            </w:pPr>
           </w:p>
           <w:p>
             <w:pPr>
@@ -1175,7 +1101,10 @@
                 <w:lang w:val="en-US" w:eastAsia="fr-MA"/>
               </w:rPr>
             </w:pPr>
-            <w:r>
+          </w:p>
+          <w:p>
+            <w:pPr>
+              <w:spacing w:after="0" w:line="240" w:lineRule="auto"/>
               <w:rPr>
                 <w:rFonts w:ascii="Aptos" w:eastAsia="Times New Roman" w:hAnsi="Aptos" w:cs="Arial"/>
                 <w:color w:val="000000"/>
@@ -1184,56 +1113,7 @@
                 <w:szCs w:val="24"/>
                 <w:lang w:val="en-US" w:eastAsia="fr-MA"/>
               </w:rPr>
-              <w:t/>
-            </w:r>
-          </w:p>
-          <w:p>
-            <w:pPr>
-              <w:spacing w:after="0" w:line="240" w:lineRule="auto"/>
-              <w:rPr>
-                <w:rFonts w:ascii="Aptos" w:eastAsia="Times New Roman" w:hAnsi="Aptos" w:cs="Arial"/>
-                <w:color w:val="000000"/>
-                <w:kern w:val="24"/>
-                <w:sz w:val="24"/>
-                <w:szCs w:val="24"/>
-                <w:lang w:val="en-US" w:eastAsia="fr-MA"/>
-              </w:rPr>
             </w:pPr>
-            <w:r>
-              <w:rPr>
-                <w:rFonts w:ascii="Aptos" w:eastAsia="Times New Roman" w:hAnsi="Aptos" w:cs="Arial"/>
-                <w:color w:val="000000"/>
-                <w:kern w:val="24"/>
-                <w:sz w:val="24"/>
-                <w:szCs w:val="24"/>
-                <w:lang w:val="en-US" w:eastAsia="fr-MA"/>
-              </w:rPr>
-              <w:t/>
-            </w:r>
-          </w:p>
-          <w:p>
-            <w:pPr>
-              <w:spacing w:after="0" w:line="240" w:lineRule="auto"/>
-              <w:rPr>
-                <w:rFonts w:ascii="Aptos" w:eastAsia="Times New Roman" w:hAnsi="Aptos" w:cs="Arial"/>
-                <w:color w:val="000000"/>
-                <w:kern w:val="24"/>
-                <w:sz w:val="24"/>
-                <w:szCs w:val="24"/>
-                <w:lang w:val="en-US" w:eastAsia="fr-MA"/>
-              </w:rPr>
-            </w:pPr>
-            <w:r>
-              <w:rPr>
-                <w:rFonts w:ascii="Aptos" w:eastAsia="Times New Roman" w:hAnsi="Aptos" w:cs="Arial"/>
-                <w:color w:val="000000"/>
-                <w:kern w:val="24"/>
-                <w:sz w:val="24"/>
-                <w:szCs w:val="24"/>
-                <w:lang w:val="en-US" w:eastAsia="fr-MA"/>
-              </w:rPr>
-              <w:t/>
-            </w:r>
           </w:p>
         </w:tc>
         <w:tc>
@@ -1289,7 +1169,10 @@
                 <w:lang w:val="en-US" w:eastAsia="fr-MA"/>
               </w:rPr>
             </w:pPr>
-            <w:r>
+          </w:p>
+          <w:p>
+            <w:pPr>
+              <w:spacing w:after="0" w:line="240" w:lineRule="auto"/>
               <w:rPr>
                 <w:rFonts w:ascii="Aptos" w:eastAsia="Times New Roman" w:hAnsi="Aptos" w:cs="Arial"/>
                 <w:color w:val="000000"/>
@@ -1298,8 +1181,7 @@
                 <w:szCs w:val="24"/>
                 <w:lang w:val="en-US" w:eastAsia="fr-MA"/>
               </w:rPr>
-              <w:t/>
-            </w:r>
+            </w:pPr>
           </w:p>
           <w:p>
             <w:pPr>
@@ -1313,7 +1195,10 @@
                 <w:lang w:val="en-US" w:eastAsia="fr-MA"/>
               </w:rPr>
             </w:pPr>
-            <w:r>
+          </w:p>
+          <w:p>
+            <w:pPr>
+              <w:spacing w:after="0" w:line="240" w:lineRule="auto"/>
               <w:rPr>
                 <w:rFonts w:ascii="Aptos" w:eastAsia="Times New Roman" w:hAnsi="Aptos" w:cs="Arial"/>
                 <w:color w:val="000000"/>
@@ -1322,56 +1207,7 @@
                 <w:szCs w:val="24"/>
                 <w:lang w:val="en-US" w:eastAsia="fr-MA"/>
               </w:rPr>
-              <w:t/>
-            </w:r>
-          </w:p>
-          <w:p>
-            <w:pPr>
-              <w:spacing w:after="0" w:line="240" w:lineRule="auto"/>
-              <w:rPr>
-                <w:rFonts w:ascii="Aptos" w:eastAsia="Times New Roman" w:hAnsi="Aptos" w:cs="Arial"/>
-                <w:color w:val="000000"/>
-                <w:kern w:val="24"/>
-                <w:sz w:val="24"/>
-                <w:szCs w:val="24"/>
-                <w:lang w:val="en-US" w:eastAsia="fr-MA"/>
-              </w:rPr>
             </w:pPr>
-            <w:r>
-              <w:rPr>
-                <w:rFonts w:ascii="Aptos" w:eastAsia="Times New Roman" w:hAnsi="Aptos" w:cs="Arial"/>
-                <w:color w:val="000000"/>
-                <w:kern w:val="24"/>
-                <w:sz w:val="24"/>
-                <w:szCs w:val="24"/>
-                <w:lang w:val="en-US" w:eastAsia="fr-MA"/>
-              </w:rPr>
-              <w:t/>
-            </w:r>
-          </w:p>
-          <w:p>
-            <w:pPr>
-              <w:spacing w:after="0" w:line="240" w:lineRule="auto"/>
-              <w:rPr>
-                <w:rFonts w:ascii="Aptos" w:eastAsia="Times New Roman" w:hAnsi="Aptos" w:cs="Arial"/>
-                <w:color w:val="000000"/>
-                <w:kern w:val="24"/>
-                <w:sz w:val="24"/>
-                <w:szCs w:val="24"/>
-                <w:lang w:val="en-US" w:eastAsia="fr-MA"/>
-              </w:rPr>
-            </w:pPr>
-            <w:r>
-              <w:rPr>
-                <w:rFonts w:ascii="Aptos" w:eastAsia="Times New Roman" w:hAnsi="Aptos" w:cs="Arial"/>
-                <w:color w:val="000000"/>
-                <w:kern w:val="24"/>
-                <w:sz w:val="24"/>
-                <w:szCs w:val="24"/>
-                <w:lang w:val="en-US" w:eastAsia="fr-MA"/>
-              </w:rPr>
-              <w:t/>
-            </w:r>
           </w:p>
         </w:tc>
       </w:tr>
@@ -1386,16 +1222,16 @@
     </w:p>
     <w:tbl>
       <w:tblPr>
-        <w:tblStyle w:val="TableGrid"/>
+        <w:tblStyle w:val="Grilledutableau"/>
         <w:tblpPr w:leftFromText="141" w:rightFromText="141" w:vertAnchor="text" w:horzAnchor="page" w:tblpX="685" w:tblpY="-17"/>
         <w:tblOverlap w:val="never"/>
         <w:tblW w:w="9776" w:type="dxa"/>
         <w:tblLook w:val="04A0" w:firstRow="1" w:lastRow="0" w:firstColumn="1" w:lastColumn="0" w:noHBand="0" w:noVBand="1"/>
       </w:tblPr>
       <w:tblGrid>
-        <w:gridCol w:w="5027"/>
-        <w:gridCol w:w="2924"/>
-        <w:gridCol w:w="1825"/>
+        <w:gridCol w:w="5382"/>
+        <w:gridCol w:w="3118"/>
+        <w:gridCol w:w="1276"/>
       </w:tblGrid>
       <w:tr>
         <w:tc>
@@ -1442,8 +1278,6 @@
               </w:rPr>
               <w:t>2500</w:t>
             </w:r>
-            <w:proofErr w:type="spellStart"/>
-            <w:proofErr w:type="spellEnd"/>
           </w:p>
         </w:tc>
       </w:tr>
@@ -1483,8 +1317,6 @@
             <w:r>
               <w:t>ARRETE LA PRESENTE FACTURE A LA SOMME DE : #Deux mille cinq cents dirhams#</w:t>
             </w:r>
-            <w:proofErr w:type="gramStart"/>
-            <w:proofErr w:type="gramEnd"/>
           </w:p>
           <w:p>
             <w:pPr>
@@ -1512,10 +1344,6 @@
               </w:rPr>
               <w:t>Attijariwafa Bank RIB :  007780000401230040249794</w:t>
             </w:r>
-            <w:proofErr w:type="gramStart"/>
-            <w:proofErr w:type="gramEnd"/>
-            <w:proofErr w:type="spellStart"/>
-            <w:proofErr w:type="spellEnd"/>
           </w:p>
         </w:tc>
       </w:tr>
@@ -1613,7 +1441,6 @@
             </wp14:sizeRelV>
           </wp:anchor>
         </w:drawing>
-        <w:t/>
       </w:r>
       <w:r>
         <w:rPr>
@@ -1671,7 +1498,7 @@
 <w:ftr xmlns:wpc="http://schemas.microsoft.com/office/word/2010/wordprocessingCanvas" xmlns:cx="http://schemas.microsoft.com/office/drawing/2014/chartex" xmlns:cx1="http://schemas.microsoft.com/office/drawing/2015/9/8/chartex" xmlns:cx2="http://schemas.microsoft.com/office/drawing/2015/10/21/chartex" xmlns:cx3="http://schemas.microsoft.com/office/drawing/2016/5/9/chartex" xmlns:cx4="http://schemas.microsoft.com/office/drawing/2016/5/10/chartex" xmlns:cx5="http://schemas.microsoft.com/office/drawing/2016/5/11/chartex" xmlns:cx6="http://schemas.microsoft.com/office/drawing/2016/5/12/chartex" xmlns:cx7="http://schemas.microsoft.com/office/drawing/2016/5/13/chartex" xmlns:cx8="http://schemas.microsoft.com/office/drawing/2016/5/14/chartex" xmlns:mc="http://schemas.openxmlformats.org/markup-compatibility/2006" xmlns:aink="http://schemas.microsoft.com/office/drawing/2016/ink" xmlns:am3d="http://schemas.microsoft.com/office/drawing/2017/model3d" xmlns:o="urn:schemas-microsoft-com:office:office" xmlns:oel="http://schemas.microsoft.com/office/2019/extlst" xmlns:r="http://schemas.openxmlformats.org/officeDocument/2006/relationships" xmlns:m="http://schemas.openxmlformats.org/officeDocument/2006/math" xmlns:v="urn:schemas-microsoft-com:vml" xmlns:wp14="http://schemas.microsoft.com/office/word/2010/wordprocessingDrawing" xmlns:wp="http://schemas.openxmlformats.org/drawingml/2006/wordprocessingDrawing" xmlns:w10="urn:schemas-microsoft-com:office:word" xmlns:w="http://schemas.openxmlformats.org/wordprocessingml/2006/main" xmlns:w14="http://schemas.microsoft.com/office/word/2010/wordml" xmlns:w15="http://schemas.microsoft.com/office/word/2012/wordml" xmlns:w16cex="http://schemas.microsoft.com/office/word/2018/wordml/cex" xmlns:w16cid="http://schemas.microsoft.com/office/word/2016/wordml/cid" xmlns:w16="http://schemas.microsoft.com/office/word/2018/wordml" xmlns:w16du="http://schemas.microsoft.com/office/word/2023/wordml/word16du" xmlns:w16sdtdh="http://schemas.microsoft.com/office/word/2020/wordml/sdtdatahash" xmlns:w16sdtfl="http://schemas.microsoft.com/office/word/2024/wordml/sdtformatlock" xmlns:w16se="http://schemas.microsoft.com/office/word/2015/wordml/symex" xmlns:wpg="http://schemas.microsoft.com/office/word/2010/wordprocessingGroup" xmlns:wpi="http://schemas.microsoft.com/office/word/2010/wordprocessingInk" xmlns:wne="http://schemas.microsoft.com/office/word/2006/wordml" xmlns:wps="http://schemas.microsoft.com/office/word/2010/wordprocessingShape" mc:Ignorable="w14 w15 w16se w16cid w16 w16cex w16sdtdh w16sdtfl w16du wp14">
   <w:p>
     <w:pPr>
-      <w:pStyle w:val="Footer"/>
+      <w:pStyle w:val="Pieddepage"/>
     </w:pPr>
   </w:p>
 </w:ftr>
@@ -1681,7 +1508,7 @@
 <w:ftr xmlns:wpc="http://schemas.microsoft.com/office/word/2010/wordprocessingCanvas" xmlns:cx="http://schemas.microsoft.com/office/drawing/2014/chartex" xmlns:cx1="http://schemas.microsoft.com/office/drawing/2015/9/8/chartex" xmlns:cx2="http://schemas.microsoft.com/office/drawing/2015/10/21/chartex" xmlns:cx3="http://schemas.microsoft.com/office/drawing/2016/5/9/chartex" xmlns:cx4="http://schemas.microsoft.com/office/drawing/2016/5/10/chartex" xmlns:cx5="http://schemas.microsoft.com/office/drawing/2016/5/11/chartex" xmlns:cx6="http://schemas.microsoft.com/office/drawing/2016/5/12/chartex" xmlns:cx7="http://schemas.microsoft.com/office/drawing/2016/5/13/chartex" xmlns:cx8="http://schemas.microsoft.com/office/drawing/2016/5/14/chartex" xmlns:mc="http://schemas.openxmlformats.org/markup-compatibility/2006" xmlns:aink="http://schemas.microsoft.com/office/drawing/2016/ink" xmlns:am3d="http://schemas.microsoft.com/office/drawing/2017/model3d" xmlns:o="urn:schemas-microsoft-com:office:office" xmlns:oel="http://schemas.microsoft.com/office/2019/extlst" xmlns:r="http://schemas.openxmlformats.org/officeDocument/2006/relationships" xmlns:m="http://schemas.openxmlformats.org/officeDocument/2006/math" xmlns:v="urn:schemas-microsoft-com:vml" xmlns:wp14="http://schemas.microsoft.com/office/word/2010/wordprocessingDrawing" xmlns:wp="http://schemas.openxmlformats.org/drawingml/2006/wordprocessingDrawing" xmlns:w10="urn:schemas-microsoft-com:office:word" xmlns:w="http://schemas.openxmlformats.org/wordprocessingml/2006/main" xmlns:w14="http://schemas.microsoft.com/office/word/2010/wordml" xmlns:w15="http://schemas.microsoft.com/office/word/2012/wordml" xmlns:w16cex="http://schemas.microsoft.com/office/word/2018/wordml/cex" xmlns:w16cid="http://schemas.microsoft.com/office/word/2016/wordml/cid" xmlns:w16="http://schemas.microsoft.com/office/word/2018/wordml" xmlns:w16du="http://schemas.microsoft.com/office/word/2023/wordml/word16du" xmlns:w16sdtdh="http://schemas.microsoft.com/office/word/2020/wordml/sdtdatahash" xmlns:w16sdtfl="http://schemas.microsoft.com/office/word/2024/wordml/sdtformatlock" xmlns:w16se="http://schemas.microsoft.com/office/word/2015/wordml/symex" xmlns:wpg="http://schemas.microsoft.com/office/word/2010/wordprocessingGroup" xmlns:wpi="http://schemas.microsoft.com/office/word/2010/wordprocessingInk" xmlns:wne="http://schemas.microsoft.com/office/word/2006/wordml" xmlns:wps="http://schemas.microsoft.com/office/word/2010/wordprocessingShape" mc:Ignorable="w14 w15 w16se w16cid w16 w16cex w16sdtdh w16sdtfl w16du wp14">
   <w:p>
     <w:pPr>
-      <w:pStyle w:val="Footer"/>
+      <w:pStyle w:val="Pieddepage"/>
       <w:rPr>
         <w:rFonts w:ascii="Calibri" w:eastAsia="Calibri" w:hAnsi="Calibri" w:cs="Times New Roman"/>
         <w:sz w:val="26"/>
@@ -1708,9 +1535,8 @@
         <w:vertAlign w:val="superscript"/>
         <w:lang w:val="x-none" w:eastAsia="x-none"/>
       </w:rPr>
-      <w:t xml:space="preserve">Art 91 – II – 1° du Code </w:t>
+      <w:t>Art 91 – II – 1° du Code Général des Impôts.</w:t>
     </w:r>
-    <w:proofErr w:type="spellStart"/>
     <w:r>
       <w:rPr>
         <w:rFonts w:ascii="Calibri" w:eastAsia="Calibri" w:hAnsi="Calibri" w:cs="Times New Roman"/>
@@ -1719,49 +1545,6 @@
         <w:vertAlign w:val="superscript"/>
         <w:lang w:val="x-none" w:eastAsia="x-none"/>
       </w:rPr>
-      <w:t>Général</w:t>
-    </w:r>
-    <w:proofErr w:type="spellEnd"/>
-    <w:r>
-      <w:rPr>
-        <w:rFonts w:ascii="Calibri" w:eastAsia="Calibri" w:hAnsi="Calibri" w:cs="Times New Roman"/>
-        <w:sz w:val="26"/>
-        <w:szCs w:val="26"/>
-        <w:vertAlign w:val="superscript"/>
-        <w:lang w:val="x-none" w:eastAsia="x-none"/>
-      </w:rPr>
-      <w:t xml:space="preserve"> des </w:t>
-    </w:r>
-    <w:proofErr w:type="spellStart"/>
-    <w:r>
-      <w:rPr>
-        <w:rFonts w:ascii="Calibri" w:eastAsia="Calibri" w:hAnsi="Calibri" w:cs="Times New Roman"/>
-        <w:sz w:val="26"/>
-        <w:szCs w:val="26"/>
-        <w:vertAlign w:val="superscript"/>
-        <w:lang w:val="x-none" w:eastAsia="x-none"/>
-      </w:rPr>
-      <w:t>Impôts</w:t>
-    </w:r>
-    <w:proofErr w:type="spellEnd"/>
-    <w:r>
-      <w:rPr>
-        <w:rFonts w:ascii="Calibri" w:eastAsia="Calibri" w:hAnsi="Calibri" w:cs="Times New Roman"/>
-        <w:sz w:val="26"/>
-        <w:szCs w:val="26"/>
-        <w:vertAlign w:val="superscript"/>
-        <w:lang w:val="x-none" w:eastAsia="x-none"/>
-      </w:rPr>
-      <w:t>.</w:t>
-    </w:r>
-    <w:r>
-      <w:rPr>
-        <w:rFonts w:ascii="Calibri" w:eastAsia="Calibri" w:hAnsi="Calibri" w:cs="Times New Roman"/>
-        <w:sz w:val="26"/>
-        <w:szCs w:val="26"/>
-        <w:vertAlign w:val="superscript"/>
-        <w:lang w:val="x-none" w:eastAsia="x-none"/>
-      </w:rPr>
       <w:t xml:space="preserve">                                          </w:t>
     </w:r>
   </w:p>
@@ -1781,7 +1564,7 @@
   </w:p>
   <w:tbl>
     <w:tblPr>
-      <w:tblStyle w:val="TableGrid"/>
+      <w:tblStyle w:val="Grilledutableau"/>
       <w:tblW w:w="0" w:type="auto"/>
       <w:tblInd w:w="-5" w:type="dxa"/>
       <w:tblBorders>
@@ -1806,7 +1589,7 @@
         </w:tcPr>
         <w:p>
           <w:pPr>
-            <w:pStyle w:val="Footer"/>
+            <w:pStyle w:val="Pieddepage"/>
             <w:jc w:val="both"/>
             <w:rPr>
               <w:rFonts w:ascii="Calibri" w:eastAsia="Calibri" w:hAnsi="Calibri" w:cs="Times New Roman"/>
@@ -1816,7 +1599,6 @@
               <w:lang w:eastAsia="x-none"/>
             </w:rPr>
           </w:pPr>
-          <w:proofErr w:type="gramStart"/>
           <w:r>
             <w:rPr>
               <w:rFonts w:ascii="Calibri" w:eastAsia="Calibri" w:hAnsi="Calibri" w:cs="Times New Roman"/>
@@ -1827,20 +1609,7 @@
               <w:vertAlign w:val="superscript"/>
               <w:lang w:eastAsia="x-none"/>
             </w:rPr>
-            <w:t>Auto Entrepreneur</w:t>
-          </w:r>
-          <w:proofErr w:type="gramEnd"/>
-          <w:r>
-            <w:rPr>
-              <w:rFonts w:ascii="Calibri" w:eastAsia="Calibri" w:hAnsi="Calibri" w:cs="Times New Roman"/>
-              <w:b/>
-              <w:bCs/>
-              <w:sz w:val="26"/>
-              <w:szCs w:val="26"/>
-              <w:vertAlign w:val="superscript"/>
-              <w:lang w:eastAsia="x-none"/>
-            </w:rPr>
-            <w:t xml:space="preserve"> :    </w:t>
+            <w:t xml:space="preserve">Auto Entrepreneur :    </w:t>
           </w:r>
           <w:r>
             <w:rPr>
@@ -1871,7 +1640,7 @@
         </w:tcPr>
         <w:p>
           <w:pPr>
-            <w:pStyle w:val="Footer"/>
+            <w:pStyle w:val="Pieddepage"/>
             <w:jc w:val="both"/>
             <w:rPr>
               <w:rFonts w:ascii="Calibri" w:eastAsia="Calibri" w:hAnsi="Calibri" w:cs="Times New Roman"/>
@@ -1914,7 +1683,7 @@
         </w:tcPr>
         <w:p>
           <w:pPr>
-            <w:pStyle w:val="Footer"/>
+            <w:pStyle w:val="Pieddepage"/>
             <w:jc w:val="both"/>
             <w:rPr>
               <w:rFonts w:ascii="Calibri" w:eastAsia="Calibri" w:hAnsi="Calibri" w:cs="Times New Roman"/>
@@ -1955,7 +1724,7 @@
         </w:tcPr>
         <w:p>
           <w:pPr>
-            <w:pStyle w:val="Footer"/>
+            <w:pStyle w:val="Pieddepage"/>
             <w:jc w:val="both"/>
             <w:rPr>
               <w:rFonts w:ascii="Calibri" w:eastAsia="Calibri" w:hAnsi="Calibri" w:cs="Times New Roman"/>
@@ -2000,7 +1769,7 @@
         </w:tcPr>
         <w:p>
           <w:pPr>
-            <w:pStyle w:val="Footer"/>
+            <w:pStyle w:val="Pieddepage"/>
             <w:jc w:val="both"/>
             <w:rPr>
               <w:rFonts w:ascii="Calibri" w:eastAsia="Calibri" w:hAnsi="Calibri" w:cs="Times New Roman"/>
@@ -2020,33 +1789,7 @@
               <w:vertAlign w:val="superscript"/>
               <w:lang w:eastAsia="x-none"/>
             </w:rPr>
-            <w:t xml:space="preserve">ICE       </w:t>
-          </w:r>
-          <w:proofErr w:type="gramStart"/>
-          <w:r>
-            <w:rPr>
-              <w:rFonts w:ascii="Calibri" w:eastAsia="Calibri" w:hAnsi="Calibri" w:cs="Times New Roman"/>
-              <w:b/>
-              <w:bCs/>
-              <w:sz w:val="26"/>
-              <w:szCs w:val="26"/>
-              <w:vertAlign w:val="superscript"/>
-              <w:lang w:eastAsia="x-none"/>
-            </w:rPr>
-            <w:t xml:space="preserve">   :</w:t>
-          </w:r>
-          <w:proofErr w:type="gramEnd"/>
-          <w:r>
-            <w:rPr>
-              <w:rFonts w:ascii="Calibri" w:eastAsia="Calibri" w:hAnsi="Calibri" w:cs="Times New Roman"/>
-              <w:b/>
-              <w:bCs/>
-              <w:sz w:val="26"/>
-              <w:szCs w:val="26"/>
-              <w:vertAlign w:val="superscript"/>
-              <w:lang w:eastAsia="x-none"/>
-            </w:rPr>
-            <w:t xml:space="preserve">                        </w:t>
+            <w:t xml:space="preserve">ICE          :                        </w:t>
           </w:r>
           <w:r>
             <w:rPr>
@@ -2069,7 +1812,7 @@
         </w:tcPr>
         <w:p>
           <w:pPr>
-            <w:pStyle w:val="Footer"/>
+            <w:pStyle w:val="Pieddepage"/>
             <w:jc w:val="both"/>
             <w:rPr>
               <w:rFonts w:ascii="Calibri" w:eastAsia="Calibri" w:hAnsi="Calibri" w:cs="Times New Roman"/>
@@ -2122,7 +1865,7 @@
         </w:tcPr>
         <w:p>
           <w:pPr>
-            <w:pStyle w:val="Footer"/>
+            <w:pStyle w:val="Pieddepage"/>
             <w:jc w:val="both"/>
             <w:rPr>
               <w:rFonts w:ascii="Calibri" w:eastAsia="Calibri" w:hAnsi="Calibri" w:cs="Times New Roman"/>
@@ -2142,33 +1885,7 @@
               <w:vertAlign w:val="superscript"/>
               <w:lang w:eastAsia="x-none"/>
             </w:rPr>
-            <w:t xml:space="preserve">IF         </w:t>
-          </w:r>
-          <w:proofErr w:type="gramStart"/>
-          <w:r>
-            <w:rPr>
-              <w:rFonts w:ascii="Calibri" w:eastAsia="Calibri" w:hAnsi="Calibri" w:cs="Times New Roman"/>
-              <w:b/>
-              <w:bCs/>
-              <w:sz w:val="26"/>
-              <w:szCs w:val="26"/>
-              <w:vertAlign w:val="superscript"/>
-              <w:lang w:eastAsia="x-none"/>
-            </w:rPr>
-            <w:t xml:space="preserve">   :</w:t>
-          </w:r>
-          <w:proofErr w:type="gramEnd"/>
-          <w:r>
-            <w:rPr>
-              <w:rFonts w:ascii="Calibri" w:eastAsia="Calibri" w:hAnsi="Calibri" w:cs="Times New Roman"/>
-              <w:b/>
-              <w:bCs/>
-              <w:sz w:val="26"/>
-              <w:szCs w:val="26"/>
-              <w:vertAlign w:val="superscript"/>
-              <w:lang w:eastAsia="x-none"/>
-            </w:rPr>
-            <w:t xml:space="preserve">                        </w:t>
+            <w:t xml:space="preserve">IF            :                        </w:t>
           </w:r>
           <w:r>
             <w:rPr>
@@ -2191,7 +1908,7 @@
         </w:tcPr>
         <w:p>
           <w:pPr>
-            <w:pStyle w:val="Footer"/>
+            <w:pStyle w:val="Pieddepage"/>
             <w:jc w:val="both"/>
             <w:rPr>
               <w:rFonts w:ascii="Calibri" w:eastAsia="Calibri" w:hAnsi="Calibri" w:cs="Times New Roman"/>
@@ -2211,33 +1928,7 @@
               <w:vertAlign w:val="superscript"/>
               <w:lang w:eastAsia="x-none"/>
             </w:rPr>
-            <w:t>TEL</w:t>
-          </w:r>
-          <w:proofErr w:type="gramStart"/>
-          <w:r>
-            <w:rPr>
-              <w:rFonts w:ascii="Calibri" w:eastAsia="Calibri" w:hAnsi="Calibri" w:cs="Times New Roman"/>
-              <w:b/>
-              <w:bCs/>
-              <w:sz w:val="26"/>
-              <w:szCs w:val="26"/>
-              <w:vertAlign w:val="superscript"/>
-              <w:lang w:eastAsia="x-none"/>
-            </w:rPr>
-            <w:t xml:space="preserve">   :</w:t>
-          </w:r>
-          <w:proofErr w:type="gramEnd"/>
-          <w:r>
-            <w:rPr>
-              <w:rFonts w:ascii="Calibri" w:eastAsia="Calibri" w:hAnsi="Calibri" w:cs="Times New Roman"/>
-              <w:b/>
-              <w:bCs/>
-              <w:sz w:val="26"/>
-              <w:szCs w:val="26"/>
-              <w:vertAlign w:val="superscript"/>
-              <w:lang w:eastAsia="x-none"/>
-            </w:rPr>
-            <w:t xml:space="preserve">                         </w:t>
+            <w:t xml:space="preserve">TEL   :                         </w:t>
           </w:r>
           <w:r>
             <w:rPr>
@@ -2255,7 +1946,7 @@
   </w:tbl>
   <w:p>
     <w:pPr>
-      <w:pStyle w:val="Footer"/>
+      <w:pStyle w:val="Pieddepage"/>
       <w:jc w:val="both"/>
       <w:rPr>
         <w:sz w:val="26"/>
@@ -2270,7 +1961,7 @@
 <w:ftr xmlns:wpc="http://schemas.microsoft.com/office/word/2010/wordprocessingCanvas" xmlns:cx="http://schemas.microsoft.com/office/drawing/2014/chartex" xmlns:cx1="http://schemas.microsoft.com/office/drawing/2015/9/8/chartex" xmlns:cx2="http://schemas.microsoft.com/office/drawing/2015/10/21/chartex" xmlns:cx3="http://schemas.microsoft.com/office/drawing/2016/5/9/chartex" xmlns:cx4="http://schemas.microsoft.com/office/drawing/2016/5/10/chartex" xmlns:cx5="http://schemas.microsoft.com/office/drawing/2016/5/11/chartex" xmlns:cx6="http://schemas.microsoft.com/office/drawing/2016/5/12/chartex" xmlns:cx7="http://schemas.microsoft.com/office/drawing/2016/5/13/chartex" xmlns:cx8="http://schemas.microsoft.com/office/drawing/2016/5/14/chartex" xmlns:mc="http://schemas.openxmlformats.org/markup-compatibility/2006" xmlns:aink="http://schemas.microsoft.com/office/drawing/2016/ink" xmlns:am3d="http://schemas.microsoft.com/office/drawing/2017/model3d" xmlns:o="urn:schemas-microsoft-com:office:office" xmlns:oel="http://schemas.microsoft.com/office/2019/extlst" xmlns:r="http://schemas.openxmlformats.org/officeDocument/2006/relationships" xmlns:m="http://schemas.openxmlformats.org/officeDocument/2006/math" xmlns:v="urn:schemas-microsoft-com:vml" xmlns:wp14="http://schemas.microsoft.com/office/word/2010/wordprocessingDrawing" xmlns:wp="http://schemas.openxmlformats.org/drawingml/2006/wordprocessingDrawing" xmlns:w10="urn:schemas-microsoft-com:office:word" xmlns:w="http://schemas.openxmlformats.org/wordprocessingml/2006/main" xmlns:w14="http://schemas.microsoft.com/office/word/2010/wordml" xmlns:w15="http://schemas.microsoft.com/office/word/2012/wordml" xmlns:w16cex="http://schemas.microsoft.com/office/word/2018/wordml/cex" xmlns:w16cid="http://schemas.microsoft.com/office/word/2016/wordml/cid" xmlns:w16="http://schemas.microsoft.com/office/word/2018/wordml" xmlns:w16du="http://schemas.microsoft.com/office/word/2023/wordml/word16du" xmlns:w16sdtdh="http://schemas.microsoft.com/office/word/2020/wordml/sdtdatahash" xmlns:w16sdtfl="http://schemas.microsoft.com/office/word/2024/wordml/sdtformatlock" xmlns:w16se="http://schemas.microsoft.com/office/word/2015/wordml/symex" xmlns:wpg="http://schemas.microsoft.com/office/word/2010/wordprocessingGroup" xmlns:wpi="http://schemas.microsoft.com/office/word/2010/wordprocessingInk" xmlns:wne="http://schemas.microsoft.com/office/word/2006/wordml" xmlns:wps="http://schemas.microsoft.com/office/word/2010/wordprocessingShape" mc:Ignorable="w14 w15 w16se w16cid w16 w16cex w16sdtdh w16sdtfl w16du wp14">
   <w:p>
     <w:pPr>
-      <w:pStyle w:val="Footer"/>
+      <w:pStyle w:val="Pieddepage"/>
     </w:pPr>
   </w:p>
 </w:ftr>
@@ -2305,7 +1996,7 @@
 <w:hdr xmlns:wpc="http://schemas.microsoft.com/office/word/2010/wordprocessingCanvas" xmlns:cx="http://schemas.microsoft.com/office/drawing/2014/chartex" xmlns:cx1="http://schemas.microsoft.com/office/drawing/2015/9/8/chartex" xmlns:cx2="http://schemas.microsoft.com/office/drawing/2015/10/21/chartex" xmlns:cx3="http://schemas.microsoft.com/office/drawing/2016/5/9/chartex" xmlns:cx4="http://schemas.microsoft.com/office/drawing/2016/5/10/chartex" xmlns:cx5="http://schemas.microsoft.com/office/drawing/2016/5/11/chartex" xmlns:cx6="http://schemas.microsoft.com/office/drawing/2016/5/12/chartex" xmlns:cx7="http://schemas.microsoft.com/office/drawing/2016/5/13/chartex" xmlns:cx8="http://schemas.microsoft.com/office/drawing/2016/5/14/chartex" xmlns:mc="http://schemas.openxmlformats.org/markup-compatibility/2006" xmlns:aink="http://schemas.microsoft.com/office/drawing/2016/ink" xmlns:am3d="http://schemas.microsoft.com/office/drawing/2017/model3d" xmlns:o="urn:schemas-microsoft-com:office:office" xmlns:oel="http://schemas.microsoft.com/office/2019/extlst" xmlns:r="http://schemas.openxmlformats.org/officeDocument/2006/relationships" xmlns:m="http://schemas.openxmlformats.org/officeDocument/2006/math" xmlns:v="urn:schemas-microsoft-com:vml" xmlns:wp14="http://schemas.microsoft.com/office/word/2010/wordprocessingDrawing" xmlns:wp="http://schemas.openxmlformats.org/drawingml/2006/wordprocessingDrawing" xmlns:w10="urn:schemas-microsoft-com:office:word" xmlns:w="http://schemas.openxmlformats.org/wordprocessingml/2006/main" xmlns:w14="http://schemas.microsoft.com/office/word/2010/wordml" xmlns:w15="http://schemas.microsoft.com/office/word/2012/wordml" xmlns:w16cex="http://schemas.microsoft.com/office/word/2018/wordml/cex" xmlns:w16cid="http://schemas.microsoft.com/office/word/2016/wordml/cid" xmlns:w16="http://schemas.microsoft.com/office/word/2018/wordml" xmlns:w16du="http://schemas.microsoft.com/office/word/2023/wordml/word16du" xmlns:w16sdtdh="http://schemas.microsoft.com/office/word/2020/wordml/sdtdatahash" xmlns:w16sdtfl="http://schemas.microsoft.com/office/word/2024/wordml/sdtformatlock" xmlns:w16se="http://schemas.microsoft.com/office/word/2015/wordml/symex" xmlns:wpg="http://schemas.microsoft.com/office/word/2010/wordprocessingGroup" xmlns:wpi="http://schemas.microsoft.com/office/word/2010/wordprocessingInk" xmlns:wne="http://schemas.microsoft.com/office/word/2006/wordml" xmlns:wps="http://schemas.microsoft.com/office/word/2010/wordprocessingShape" mc:Ignorable="w14 w15 w16se w16cid w16 w16cex w16sdtdh w16sdtfl w16du wp14">
   <w:p>
     <w:pPr>
-      <w:pStyle w:val="Header"/>
+      <w:pStyle w:val="En-tte"/>
     </w:pPr>
   </w:p>
 </w:hdr>
@@ -2315,7 +2006,7 @@
 <w:hdr xmlns:wpc="http://schemas.microsoft.com/office/word/2010/wordprocessingCanvas" xmlns:cx="http://schemas.microsoft.com/office/drawing/2014/chartex" xmlns:cx1="http://schemas.microsoft.com/office/drawing/2015/9/8/chartex" xmlns:cx2="http://schemas.microsoft.com/office/drawing/2015/10/21/chartex" xmlns:cx3="http://schemas.microsoft.com/office/drawing/2016/5/9/chartex" xmlns:cx4="http://schemas.microsoft.com/office/drawing/2016/5/10/chartex" xmlns:cx5="http://schemas.microsoft.com/office/drawing/2016/5/11/chartex" xmlns:cx6="http://schemas.microsoft.com/office/drawing/2016/5/12/chartex" xmlns:cx7="http://schemas.microsoft.com/office/drawing/2016/5/13/chartex" xmlns:cx8="http://schemas.microsoft.com/office/drawing/2016/5/14/chartex" xmlns:mc="http://schemas.openxmlformats.org/markup-compatibility/2006" xmlns:aink="http://schemas.microsoft.com/office/drawing/2016/ink" xmlns:am3d="http://schemas.microsoft.com/office/drawing/2017/model3d" xmlns:o="urn:schemas-microsoft-com:office:office" xmlns:oel="http://schemas.microsoft.com/office/2019/extlst" xmlns:r="http://schemas.openxmlformats.org/officeDocument/2006/relationships" xmlns:m="http://schemas.openxmlformats.org/officeDocument/2006/math" xmlns:v="urn:schemas-microsoft-com:vml" xmlns:wp14="http://schemas.microsoft.com/office/word/2010/wordprocessingDrawing" xmlns:wp="http://schemas.openxmlformats.org/drawingml/2006/wordprocessingDrawing" xmlns:w10="urn:schemas-microsoft-com:office:word" xmlns:w="http://schemas.openxmlformats.org/wordprocessingml/2006/main" xmlns:w14="http://schemas.microsoft.com/office/word/2010/wordml" xmlns:w15="http://schemas.microsoft.com/office/word/2012/wordml" xmlns:w16cex="http://schemas.microsoft.com/office/word/2018/wordml/cex" xmlns:w16cid="http://schemas.microsoft.com/office/word/2016/wordml/cid" xmlns:w16="http://schemas.microsoft.com/office/word/2018/wordml" xmlns:w16du="http://schemas.microsoft.com/office/word/2023/wordml/word16du" xmlns:w16sdtdh="http://schemas.microsoft.com/office/word/2020/wordml/sdtdatahash" xmlns:w16sdtfl="http://schemas.microsoft.com/office/word/2024/wordml/sdtformatlock" xmlns:w16se="http://schemas.microsoft.com/office/word/2015/wordml/symex" xmlns:wpg="http://schemas.microsoft.com/office/word/2010/wordprocessingGroup" xmlns:wpi="http://schemas.microsoft.com/office/word/2010/wordprocessingInk" xmlns:wne="http://schemas.microsoft.com/office/word/2006/wordml" xmlns:wps="http://schemas.microsoft.com/office/word/2010/wordprocessingShape" mc:Ignorable="w14 w15 w16se w16cid w16 w16cex w16sdtdh w16sdtfl w16du wp14">
   <w:p>
     <w:pPr>
-      <w:pStyle w:val="Header"/>
+      <w:pStyle w:val="En-tte"/>
     </w:pPr>
   </w:p>
 </w:hdr>
@@ -2325,7 +2016,7 @@
 <w:hdr xmlns:wpc="http://schemas.microsoft.com/office/word/2010/wordprocessingCanvas" xmlns:cx="http://schemas.microsoft.com/office/drawing/2014/chartex" xmlns:cx1="http://schemas.microsoft.com/office/drawing/2015/9/8/chartex" xmlns:cx2="http://schemas.microsoft.com/office/drawing/2015/10/21/chartex" xmlns:cx3="http://schemas.microsoft.com/office/drawing/2016/5/9/chartex" xmlns:cx4="http://schemas.microsoft.com/office/drawing/2016/5/10/chartex" xmlns:cx5="http://schemas.microsoft.com/office/drawing/2016/5/11/chartex" xmlns:cx6="http://schemas.microsoft.com/office/drawing/2016/5/12/chartex" xmlns:cx7="http://schemas.microsoft.com/office/drawing/2016/5/13/chartex" xmlns:cx8="http://schemas.microsoft.com/office/drawing/2016/5/14/chartex" xmlns:mc="http://schemas.openxmlformats.org/markup-compatibility/2006" xmlns:aink="http://schemas.microsoft.com/office/drawing/2016/ink" xmlns:am3d="http://schemas.microsoft.com/office/drawing/2017/model3d" xmlns:o="urn:schemas-microsoft-com:office:office" xmlns:oel="http://schemas.microsoft.com/office/2019/extlst" xmlns:r="http://schemas.openxmlformats.org/officeDocument/2006/relationships" xmlns:m="http://schemas.openxmlformats.org/officeDocument/2006/math" xmlns:v="urn:schemas-microsoft-com:vml" xmlns:wp14="http://schemas.microsoft.com/office/word/2010/wordprocessingDrawing" xmlns:wp="http://schemas.openxmlformats.org/drawingml/2006/wordprocessingDrawing" xmlns:w10="urn:schemas-microsoft-com:office:word" xmlns:w="http://schemas.openxmlformats.org/wordprocessingml/2006/main" xmlns:w14="http://schemas.microsoft.com/office/word/2010/wordml" xmlns:w15="http://schemas.microsoft.com/office/word/2012/wordml" xmlns:w16cex="http://schemas.microsoft.com/office/word/2018/wordml/cex" xmlns:w16cid="http://schemas.microsoft.com/office/word/2016/wordml/cid" xmlns:w16="http://schemas.microsoft.com/office/word/2018/wordml" xmlns:w16du="http://schemas.microsoft.com/office/word/2023/wordml/word16du" xmlns:w16sdtdh="http://schemas.microsoft.com/office/word/2020/wordml/sdtdatahash" xmlns:w16sdtfl="http://schemas.microsoft.com/office/word/2024/wordml/sdtformatlock" xmlns:w16se="http://schemas.microsoft.com/office/word/2015/wordml/symex" xmlns:wpg="http://schemas.microsoft.com/office/word/2010/wordprocessingGroup" xmlns:wpi="http://schemas.microsoft.com/office/word/2010/wordprocessingInk" xmlns:wne="http://schemas.microsoft.com/office/word/2006/wordml" xmlns:wps="http://schemas.microsoft.com/office/word/2010/wordprocessingShape" mc:Ignorable="w14 w15 w16se w16cid w16 w16cex w16sdtdh w16sdtfl w16du wp14">
   <w:p>
     <w:pPr>
-      <w:pStyle w:val="Header"/>
+      <w:pStyle w:val="En-tte"/>
     </w:pPr>
   </w:p>
 </w:hdr>
@@ -3370,11 +3061,11 @@
     <w:qFormat/>
     <w:rsid w:val="00393904"/>
   </w:style>
-  <w:style w:type="paragraph" w:styleId="Heading1">
+  <w:style w:type="paragraph" w:styleId="Titre1">
     <w:name w:val="heading 1"/>
     <w:basedOn w:val="Normal"/>
     <w:next w:val="Normal"/>
-    <w:link w:val="Heading1Char"/>
+    <w:link w:val="Titre1Car"/>
     <w:uiPriority w:val="9"/>
     <w:qFormat/>
     <w:rsid w:val="00A179B6"/>
@@ -3391,11 +3082,11 @@
       <w:szCs w:val="40"/>
     </w:rPr>
   </w:style>
-  <w:style w:type="paragraph" w:styleId="Heading2">
+  <w:style w:type="paragraph" w:styleId="Titre2">
     <w:name w:val="heading 2"/>
     <w:basedOn w:val="Normal"/>
     <w:next w:val="Normal"/>
-    <w:link w:val="Heading2Char"/>
+    <w:link w:val="Titre2Car"/>
     <w:uiPriority w:val="9"/>
     <w:semiHidden/>
     <w:unhideWhenUsed/>
@@ -3414,11 +3105,11 @@
       <w:szCs w:val="32"/>
     </w:rPr>
   </w:style>
-  <w:style w:type="paragraph" w:styleId="Heading3">
+  <w:style w:type="paragraph" w:styleId="Titre3">
     <w:name w:val="heading 3"/>
     <w:basedOn w:val="Normal"/>
     <w:next w:val="Normal"/>
-    <w:link w:val="Heading3Char"/>
+    <w:link w:val="Titre3Car"/>
     <w:uiPriority w:val="9"/>
     <w:semiHidden/>
     <w:unhideWhenUsed/>
@@ -3437,11 +3128,11 @@
       <w:szCs w:val="28"/>
     </w:rPr>
   </w:style>
-  <w:style w:type="paragraph" w:styleId="Heading4">
+  <w:style w:type="paragraph" w:styleId="Titre4">
     <w:name w:val="heading 4"/>
     <w:basedOn w:val="Normal"/>
     <w:next w:val="Normal"/>
-    <w:link w:val="Heading4Char"/>
+    <w:link w:val="Titre4Car"/>
     <w:uiPriority w:val="9"/>
     <w:semiHidden/>
     <w:unhideWhenUsed/>
@@ -3460,11 +3151,11 @@
       <w:color w:val="2F5496" w:themeColor="accent1" w:themeShade="BF"/>
     </w:rPr>
   </w:style>
-  <w:style w:type="paragraph" w:styleId="Heading5">
+  <w:style w:type="paragraph" w:styleId="Titre5">
     <w:name w:val="heading 5"/>
     <w:basedOn w:val="Normal"/>
     <w:next w:val="Normal"/>
-    <w:link w:val="Heading5Char"/>
+    <w:link w:val="Titre5Car"/>
     <w:uiPriority w:val="9"/>
     <w:semiHidden/>
     <w:unhideWhenUsed/>
@@ -3481,11 +3172,11 @@
       <w:color w:val="2F5496" w:themeColor="accent1" w:themeShade="BF"/>
     </w:rPr>
   </w:style>
-  <w:style w:type="paragraph" w:styleId="Heading6">
+  <w:style w:type="paragraph" w:styleId="Titre6">
     <w:name w:val="heading 6"/>
     <w:basedOn w:val="Normal"/>
     <w:next w:val="Normal"/>
-    <w:link w:val="Heading6Char"/>
+    <w:link w:val="Titre6Car"/>
     <w:uiPriority w:val="9"/>
     <w:semiHidden/>
     <w:unhideWhenUsed/>
@@ -3504,11 +3195,11 @@
       <w:color w:val="595959" w:themeColor="text1" w:themeTint="A6"/>
     </w:rPr>
   </w:style>
-  <w:style w:type="paragraph" w:styleId="Heading7">
+  <w:style w:type="paragraph" w:styleId="Titre7">
     <w:name w:val="heading 7"/>
     <w:basedOn w:val="Normal"/>
     <w:next w:val="Normal"/>
-    <w:link w:val="Heading7Char"/>
+    <w:link w:val="Titre7Car"/>
     <w:uiPriority w:val="9"/>
     <w:semiHidden/>
     <w:unhideWhenUsed/>
@@ -3525,11 +3216,11 @@
       <w:color w:val="595959" w:themeColor="text1" w:themeTint="A6"/>
     </w:rPr>
   </w:style>
-  <w:style w:type="paragraph" w:styleId="Heading8">
+  <w:style w:type="paragraph" w:styleId="Titre8">
     <w:name w:val="heading 8"/>
     <w:basedOn w:val="Normal"/>
     <w:next w:val="Normal"/>
-    <w:link w:val="Heading8Char"/>
+    <w:link w:val="Titre8Car"/>
     <w:uiPriority w:val="9"/>
     <w:semiHidden/>
     <w:unhideWhenUsed/>
@@ -3548,11 +3239,11 @@
       <w:color w:val="272727" w:themeColor="text1" w:themeTint="D8"/>
     </w:rPr>
   </w:style>
-  <w:style w:type="paragraph" w:styleId="Heading9">
+  <w:style w:type="paragraph" w:styleId="Titre9">
     <w:name w:val="heading 9"/>
     <w:basedOn w:val="Normal"/>
     <w:next w:val="Normal"/>
-    <w:link w:val="Heading9Char"/>
+    <w:link w:val="Titre9Car"/>
     <w:uiPriority w:val="9"/>
     <w:semiHidden/>
     <w:unhideWhenUsed/>
@@ -3569,13 +3260,13 @@
       <w:color w:val="272727" w:themeColor="text1" w:themeTint="D8"/>
     </w:rPr>
   </w:style>
-  <w:style w:type="character" w:default="1" w:styleId="DefaultParagraphFont">
+  <w:style w:type="character" w:default="1" w:styleId="Policepardfaut">
     <w:name w:val="Default Paragraph Font"/>
     <w:uiPriority w:val="1"/>
     <w:semiHidden/>
     <w:unhideWhenUsed/>
   </w:style>
-  <w:style w:type="table" w:default="1" w:styleId="TableNormal">
+  <w:style w:type="table" w:default="1" w:styleId="TableauNormal">
     <w:name w:val="Normal Table"/>
     <w:uiPriority w:val="99"/>
     <w:semiHidden/>
@@ -3590,16 +3281,16 @@
       </w:tblCellMar>
     </w:tblPr>
   </w:style>
-  <w:style w:type="numbering" w:default="1" w:styleId="NoList">
+  <w:style w:type="numbering" w:default="1" w:styleId="Aucuneliste">
     <w:name w:val="No List"/>
     <w:uiPriority w:val="99"/>
     <w:semiHidden/>
     <w:unhideWhenUsed/>
   </w:style>
-  <w:style w:type="character" w:customStyle="1" w:styleId="Heading1Char">
-    <w:name w:val="Heading 1 Char"/>
-    <w:basedOn w:val="DefaultParagraphFont"/>
-    <w:link w:val="Heading1"/>
+  <w:style w:type="character" w:customStyle="1" w:styleId="Titre1Car">
+    <w:name w:val="Titre 1 Car"/>
+    <w:basedOn w:val="Policepardfaut"/>
+    <w:link w:val="Titre1"/>
     <w:uiPriority w:val="9"/>
     <w:rsid w:val="00A179B6"/>
     <w:rPr>
@@ -3609,10 +3300,10 @@
       <w:szCs w:val="40"/>
     </w:rPr>
   </w:style>
-  <w:style w:type="character" w:customStyle="1" w:styleId="Heading2Char">
-    <w:name w:val="Heading 2 Char"/>
-    <w:basedOn w:val="DefaultParagraphFont"/>
-    <w:link w:val="Heading2"/>
+  <w:style w:type="character" w:customStyle="1" w:styleId="Titre2Car">
+    <w:name w:val="Titre 2 Car"/>
+    <w:basedOn w:val="Policepardfaut"/>
+    <w:link w:val="Titre2"/>
     <w:uiPriority w:val="9"/>
     <w:semiHidden/>
     <w:rsid w:val="00A179B6"/>
@@ -3623,10 +3314,10 @@
       <w:szCs w:val="32"/>
     </w:rPr>
   </w:style>
-  <w:style w:type="character" w:customStyle="1" w:styleId="Heading3Char">
-    <w:name w:val="Heading 3 Char"/>
-    <w:basedOn w:val="DefaultParagraphFont"/>
-    <w:link w:val="Heading3"/>
+  <w:style w:type="character" w:customStyle="1" w:styleId="Titre3Car">
+    <w:name w:val="Titre 3 Car"/>
+    <w:basedOn w:val="Policepardfaut"/>
+    <w:link w:val="Titre3"/>
     <w:uiPriority w:val="9"/>
     <w:semiHidden/>
     <w:rsid w:val="00A179B6"/>
@@ -3637,10 +3328,10 @@
       <w:szCs w:val="28"/>
     </w:rPr>
   </w:style>
-  <w:style w:type="character" w:customStyle="1" w:styleId="Heading4Char">
-    <w:name w:val="Heading 4 Char"/>
-    <w:basedOn w:val="DefaultParagraphFont"/>
-    <w:link w:val="Heading4"/>
+  <w:style w:type="character" w:customStyle="1" w:styleId="Titre4Car">
+    <w:name w:val="Titre 4 Car"/>
+    <w:basedOn w:val="Policepardfaut"/>
+    <w:link w:val="Titre4"/>
     <w:uiPriority w:val="9"/>
     <w:semiHidden/>
     <w:rsid w:val="00A179B6"/>
@@ -3651,10 +3342,10 @@
       <w:color w:val="2F5496" w:themeColor="accent1" w:themeShade="BF"/>
     </w:rPr>
   </w:style>
-  <w:style w:type="character" w:customStyle="1" w:styleId="Heading5Char">
-    <w:name w:val="Heading 5 Char"/>
-    <w:basedOn w:val="DefaultParagraphFont"/>
-    <w:link w:val="Heading5"/>
+  <w:style w:type="character" w:customStyle="1" w:styleId="Titre5Car">
+    <w:name w:val="Titre 5 Car"/>
+    <w:basedOn w:val="Policepardfaut"/>
+    <w:link w:val="Titre5"/>
     <w:uiPriority w:val="9"/>
     <w:semiHidden/>
     <w:rsid w:val="00A179B6"/>
@@ -3663,10 +3354,10 @@
       <w:color w:val="2F5496" w:themeColor="accent1" w:themeShade="BF"/>
     </w:rPr>
   </w:style>
-  <w:style w:type="character" w:customStyle="1" w:styleId="Heading6Char">
-    <w:name w:val="Heading 6 Char"/>
-    <w:basedOn w:val="DefaultParagraphFont"/>
-    <w:link w:val="Heading6"/>
+  <w:style w:type="character" w:customStyle="1" w:styleId="Titre6Car">
+    <w:name w:val="Titre 6 Car"/>
+    <w:basedOn w:val="Policepardfaut"/>
+    <w:link w:val="Titre6"/>
     <w:uiPriority w:val="9"/>
     <w:semiHidden/>
     <w:rsid w:val="00A179B6"/>
@@ -3677,10 +3368,10 @@
       <w:color w:val="595959" w:themeColor="text1" w:themeTint="A6"/>
     </w:rPr>
   </w:style>
-  <w:style w:type="character" w:customStyle="1" w:styleId="Heading7Char">
-    <w:name w:val="Heading 7 Char"/>
-    <w:basedOn w:val="DefaultParagraphFont"/>
-    <w:link w:val="Heading7"/>
+  <w:style w:type="character" w:customStyle="1" w:styleId="Titre7Car">
+    <w:name w:val="Titre 7 Car"/>
+    <w:basedOn w:val="Policepardfaut"/>
+    <w:link w:val="Titre7"/>
     <w:uiPriority w:val="9"/>
     <w:semiHidden/>
     <w:rsid w:val="00A179B6"/>
@@ -3689,10 +3380,10 @@
       <w:color w:val="595959" w:themeColor="text1" w:themeTint="A6"/>
     </w:rPr>
   </w:style>
-  <w:style w:type="character" w:customStyle="1" w:styleId="Heading8Char">
-    <w:name w:val="Heading 8 Char"/>
-    <w:basedOn w:val="DefaultParagraphFont"/>
-    <w:link w:val="Heading8"/>
+  <w:style w:type="character" w:customStyle="1" w:styleId="Titre8Car">
+    <w:name w:val="Titre 8 Car"/>
+    <w:basedOn w:val="Policepardfaut"/>
+    <w:link w:val="Titre8"/>
     <w:uiPriority w:val="9"/>
     <w:semiHidden/>
     <w:rsid w:val="00A179B6"/>
@@ -3703,10 +3394,10 @@
       <w:color w:val="272727" w:themeColor="text1" w:themeTint="D8"/>
     </w:rPr>
   </w:style>
-  <w:style w:type="character" w:customStyle="1" w:styleId="Heading9Char">
-    <w:name w:val="Heading 9 Char"/>
-    <w:basedOn w:val="DefaultParagraphFont"/>
-    <w:link w:val="Heading9"/>
+  <w:style w:type="character" w:customStyle="1" w:styleId="Titre9Car">
+    <w:name w:val="Titre 9 Car"/>
+    <w:basedOn w:val="Policepardfaut"/>
+    <w:link w:val="Titre9"/>
     <w:uiPriority w:val="9"/>
     <w:semiHidden/>
     <w:rsid w:val="00A179B6"/>
@@ -3715,11 +3406,11 @@
       <w:color w:val="272727" w:themeColor="text1" w:themeTint="D8"/>
     </w:rPr>
   </w:style>
-  <w:style w:type="paragraph" w:styleId="Title">
+  <w:style w:type="paragraph" w:styleId="Titre">
     <w:name w:val="Title"/>
     <w:basedOn w:val="Normal"/>
     <w:next w:val="Normal"/>
-    <w:link w:val="TitleChar"/>
+    <w:link w:val="TitreCar"/>
     <w:uiPriority w:val="10"/>
     <w:qFormat/>
     <w:rsid w:val="00A179B6"/>
@@ -3735,10 +3426,10 @@
       <w:szCs w:val="56"/>
     </w:rPr>
   </w:style>
-  <w:style w:type="character" w:customStyle="1" w:styleId="TitleChar">
-    <w:name w:val="Title Char"/>
-    <w:basedOn w:val="DefaultParagraphFont"/>
-    <w:link w:val="Title"/>
+  <w:style w:type="character" w:customStyle="1" w:styleId="TitreCar">
+    <w:name w:val="Titre Car"/>
+    <w:basedOn w:val="Policepardfaut"/>
+    <w:link w:val="Titre"/>
     <w:uiPriority w:val="10"/>
     <w:rsid w:val="00A179B6"/>
     <w:rPr>
@@ -3749,11 +3440,11 @@
       <w:szCs w:val="56"/>
     </w:rPr>
   </w:style>
-  <w:style w:type="paragraph" w:styleId="Subtitle">
+  <w:style w:type="paragraph" w:styleId="Sous-titre">
     <w:name w:val="Subtitle"/>
     <w:basedOn w:val="Normal"/>
     <w:next w:val="Normal"/>
-    <w:link w:val="SubtitleChar"/>
+    <w:link w:val="Sous-titreCar"/>
     <w:uiPriority w:val="11"/>
     <w:qFormat/>
     <w:rsid w:val="00A179B6"/>
@@ -3770,10 +3461,10 @@
       <w:szCs w:val="28"/>
     </w:rPr>
   </w:style>
-  <w:style w:type="character" w:customStyle="1" w:styleId="SubtitleChar">
-    <w:name w:val="Subtitle Char"/>
-    <w:basedOn w:val="DefaultParagraphFont"/>
-    <w:link w:val="Subtitle"/>
+  <w:style w:type="character" w:customStyle="1" w:styleId="Sous-titreCar">
+    <w:name w:val="Sous-titre Car"/>
+    <w:basedOn w:val="Policepardfaut"/>
+    <w:link w:val="Sous-titre"/>
     <w:uiPriority w:val="11"/>
     <w:rsid w:val="00A179B6"/>
     <w:rPr>
@@ -3784,11 +3475,11 @@
       <w:szCs w:val="28"/>
     </w:rPr>
   </w:style>
-  <w:style w:type="paragraph" w:styleId="Quote">
+  <w:style w:type="paragraph" w:styleId="Citation">
     <w:name w:val="Quote"/>
     <w:basedOn w:val="Normal"/>
     <w:next w:val="Normal"/>
-    <w:link w:val="QuoteChar"/>
+    <w:link w:val="CitationCar"/>
     <w:uiPriority w:val="29"/>
     <w:qFormat/>
     <w:rsid w:val="00A179B6"/>
@@ -3802,10 +3493,10 @@
       <w:color w:val="404040" w:themeColor="text1" w:themeTint="BF"/>
     </w:rPr>
   </w:style>
-  <w:style w:type="character" w:customStyle="1" w:styleId="QuoteChar">
-    <w:name w:val="Quote Char"/>
-    <w:basedOn w:val="DefaultParagraphFont"/>
-    <w:link w:val="Quote"/>
+  <w:style w:type="character" w:customStyle="1" w:styleId="CitationCar">
+    <w:name w:val="Citation Car"/>
+    <w:basedOn w:val="Policepardfaut"/>
+    <w:link w:val="Citation"/>
     <w:uiPriority w:val="29"/>
     <w:rsid w:val="00A179B6"/>
     <w:rPr>
@@ -3814,7 +3505,7 @@
       <w:color w:val="404040" w:themeColor="text1" w:themeTint="BF"/>
     </w:rPr>
   </w:style>
-  <w:style w:type="paragraph" w:styleId="ListParagraph">
+  <w:style w:type="paragraph" w:styleId="Paragraphedeliste">
     <w:name w:val="List Paragraph"/>
     <w:basedOn w:val="Normal"/>
     <w:uiPriority w:val="34"/>
@@ -3825,9 +3516,9 @@
       <w:contextualSpacing/>
     </w:pPr>
   </w:style>
-  <w:style w:type="character" w:styleId="IntenseEmphasis">
+  <w:style w:type="character" w:styleId="Accentuationintense">
     <w:name w:val="Intense Emphasis"/>
-    <w:basedOn w:val="DefaultParagraphFont"/>
+    <w:basedOn w:val="Policepardfaut"/>
     <w:uiPriority w:val="21"/>
     <w:qFormat/>
     <w:rsid w:val="00A179B6"/>
@@ -3837,11 +3528,11 @@
       <w:color w:val="2F5496" w:themeColor="accent1" w:themeShade="BF"/>
     </w:rPr>
   </w:style>
-  <w:style w:type="paragraph" w:styleId="IntenseQuote">
+  <w:style w:type="paragraph" w:styleId="Citationintense">
     <w:name w:val="Intense Quote"/>
     <w:basedOn w:val="Normal"/>
     <w:next w:val="Normal"/>
-    <w:link w:val="IntenseQuoteChar"/>
+    <w:link w:val="CitationintenseCar"/>
     <w:uiPriority w:val="30"/>
     <w:qFormat/>
     <w:rsid w:val="00A179B6"/>
@@ -3860,10 +3551,10 @@
       <w:color w:val="2F5496" w:themeColor="accent1" w:themeShade="BF"/>
     </w:rPr>
   </w:style>
-  <w:style w:type="character" w:customStyle="1" w:styleId="IntenseQuoteChar">
-    <w:name w:val="Intense Quote Char"/>
-    <w:basedOn w:val="DefaultParagraphFont"/>
-    <w:link w:val="IntenseQuote"/>
+  <w:style w:type="character" w:customStyle="1" w:styleId="CitationintenseCar">
+    <w:name w:val="Citation intense Car"/>
+    <w:basedOn w:val="Policepardfaut"/>
+    <w:link w:val="Citationintense"/>
     <w:uiPriority w:val="30"/>
     <w:rsid w:val="00A179B6"/>
     <w:rPr>
@@ -3872,9 +3563,9 @@
       <w:color w:val="2F5496" w:themeColor="accent1" w:themeShade="BF"/>
     </w:rPr>
   </w:style>
-  <w:style w:type="character" w:styleId="IntenseReference">
+  <w:style w:type="character" w:styleId="Rfrenceintense">
     <w:name w:val="Intense Reference"/>
-    <w:basedOn w:val="DefaultParagraphFont"/>
+    <w:basedOn w:val="Policepardfaut"/>
     <w:uiPriority w:val="32"/>
     <w:qFormat/>
     <w:rsid w:val="00A179B6"/>
@@ -3886,10 +3577,10 @@
       <w:spacing w:val="5"/>
     </w:rPr>
   </w:style>
-  <w:style w:type="paragraph" w:styleId="FootnoteText">
+  <w:style w:type="paragraph" w:styleId="Notedebasdepage">
     <w:name w:val="footnote text"/>
     <w:basedOn w:val="Normal"/>
-    <w:link w:val="FootnoteTextChar"/>
+    <w:link w:val="NotedebasdepageCar"/>
     <w:uiPriority w:val="99"/>
     <w:unhideWhenUsed/>
     <w:rsid w:val="00EF4D84"/>
@@ -3903,10 +3594,10 @@
       <w:lang w:val="x-none" w:eastAsia="x-none"/>
     </w:rPr>
   </w:style>
-  <w:style w:type="character" w:customStyle="1" w:styleId="FootnoteTextChar">
-    <w:name w:val="Footnote Text Char"/>
-    <w:basedOn w:val="DefaultParagraphFont"/>
-    <w:link w:val="FootnoteText"/>
+  <w:style w:type="character" w:customStyle="1" w:styleId="NotedebasdepageCar">
+    <w:name w:val="Note de bas de page Car"/>
+    <w:basedOn w:val="Policepardfaut"/>
+    <w:link w:val="Notedebasdepage"/>
     <w:uiPriority w:val="99"/>
     <w:rsid w:val="00EF4D84"/>
     <w:rPr>
@@ -3916,7 +3607,7 @@
       <w:lang w:val="x-none" w:eastAsia="x-none"/>
     </w:rPr>
   </w:style>
-  <w:style w:type="character" w:styleId="FootnoteReference">
+  <w:style w:type="character" w:styleId="Appelnotedebasdep">
     <w:name w:val="footnote reference"/>
     <w:uiPriority w:val="99"/>
     <w:semiHidden/>
@@ -3926,10 +3617,10 @@
       <w:vertAlign w:val="superscript"/>
     </w:rPr>
   </w:style>
-  <w:style w:type="paragraph" w:styleId="Header">
+  <w:style w:type="paragraph" w:styleId="En-tte">
     <w:name w:val="header"/>
     <w:basedOn w:val="Normal"/>
-    <w:link w:val="HeaderChar"/>
+    <w:link w:val="En-tteCar"/>
     <w:uiPriority w:val="99"/>
     <w:unhideWhenUsed/>
     <w:rsid w:val="00EF4D84"/>
@@ -3941,17 +3632,17 @@
       <w:spacing w:after="0" w:line="240" w:lineRule="auto"/>
     </w:pPr>
   </w:style>
-  <w:style w:type="character" w:customStyle="1" w:styleId="HeaderChar">
-    <w:name w:val="Header Char"/>
-    <w:basedOn w:val="DefaultParagraphFont"/>
-    <w:link w:val="Header"/>
+  <w:style w:type="character" w:customStyle="1" w:styleId="En-tteCar">
+    <w:name w:val="En-tête Car"/>
+    <w:basedOn w:val="Policepardfaut"/>
+    <w:link w:val="En-tte"/>
     <w:uiPriority w:val="99"/>
     <w:rsid w:val="00EF4D84"/>
   </w:style>
-  <w:style w:type="paragraph" w:styleId="Footer">
+  <w:style w:type="paragraph" w:styleId="Pieddepage">
     <w:name w:val="footer"/>
     <w:basedOn w:val="Normal"/>
-    <w:link w:val="FooterChar"/>
+    <w:link w:val="PieddepageCar"/>
     <w:uiPriority w:val="99"/>
     <w:unhideWhenUsed/>
     <w:rsid w:val="00EF4D84"/>
@@ -3963,16 +3654,16 @@
       <w:spacing w:after="0" w:line="240" w:lineRule="auto"/>
     </w:pPr>
   </w:style>
-  <w:style w:type="character" w:customStyle="1" w:styleId="FooterChar">
-    <w:name w:val="Footer Char"/>
-    <w:basedOn w:val="DefaultParagraphFont"/>
-    <w:link w:val="Footer"/>
+  <w:style w:type="character" w:customStyle="1" w:styleId="PieddepageCar">
+    <w:name w:val="Pied de page Car"/>
+    <w:basedOn w:val="Policepardfaut"/>
+    <w:link w:val="Pieddepage"/>
     <w:uiPriority w:val="99"/>
     <w:rsid w:val="00EF4D84"/>
   </w:style>
-  <w:style w:type="table" w:styleId="TableGrid">
+  <w:style w:type="table" w:styleId="Grilledutableau">
     <w:name w:val="Table Grid"/>
-    <w:basedOn w:val="TableNormal"/>
+    <w:basedOn w:val="TableauNormal"/>
     <w:uiPriority w:val="39"/>
     <w:rsid w:val="003E66F8"/>
     <w:pPr>

</xml_diff>